<commit_message>
Supplementary: reflect that .xtdb can be loaded and read too
Three spots stopped at .utdb: the format-detection note (Section 2), the file-upload
walkthrough (Section 7), and the built-in list (Section 8). Each now states the picker
also accepts an .xtdb, which the page reads in the third-generation card, and lists the
two shipped XTDB examples.

Co-Authored-By: Claude Opus 4.8 <noreply@anthropic.com>
</commit_message>
<xml_diff>
--- a/paper/Supplementary_S1_primer.docx
+++ b/paper/Supplementary_S1_primer.docx
@@ -375,7 +375,7 @@
         <w:pStyle w:val="BodyText"/>
       </w:pPr>
       <w:r>
-        <w:t xml:space="preserve">For the main calculator the distinction hardly matters; the page detects a .dat, .tdb, or .utdb file when it loads. The newest format, .xtdb, is read in a dedicated card of its own (Section 7), because it carries a more modern description of how materials behave at very low temperatures.</w:t>
+        <w:t xml:space="preserve">You never choose a format by hand; the page reads all four and detects which one a file is when it loads. A .dat, .tdb, or .utdb opens in the main calculator, and an .xtdb opens in the third-generation card of its own (Section 7), because it carries a more modern description of how materials behave at very low temperatures. Any of the four can be one of the built-in buttons or a file you load yourself.</w:t>
       </w:r>
     </w:p>
     <w:bookmarkEnd w:id="2324"/>
@@ -759,7 +759,7 @@
         <w:t xml:space="preserve"> </w:t>
       </w:r>
       <w:r>
-        <w:t xml:space="preserve">and pick the file. It loads exactly like the built-in buttons and every calculator on the page switches to it. Uploaded files are temporary; they live only in the open tab and vanish on refresh, and up to three can be loaded at once, each pinned as a button whose color marks its dialect, so you can switch between them. That also means systems from different sources sit side by side in one page, and the unified .utdb dialect goes further by holding, for example, an alloy and a molten salt in a single file; your systems are never split across separate products. Nothing is uploaded anywhere; the file is read inside your browser and stays on your machine, which also means confidential files are safe to load.</w:t>
+        <w:t xml:space="preserve">(the same picker also accepts a .utdb or an .xtdb) and pick the file. A .dat, .tdb, or .utdb loads exactly like the built-in buttons and every calculator on the page switches to it; an .xtdb opens in the third-generation card described just below, read the same way. Uploaded files are temporary; they live only in the open tab and vanish on refresh, and up to three can be loaded at once, each pinned as a button whose color marks its dialect, so you can switch between them. That also means systems from different sources sit side by side in one page, and the unified .utdb dialect goes further by holding, for example, an alloy and a molten salt in a single file; your systems are never split across separate products. Nothing is uploaded anywhere; the file is read inside your browser and stays on your machine, which also means confidential files are safe to load.</w:t>
       </w:r>
     </w:p>
     <w:p>
@@ -801,7 +801,7 @@
         <w:pStyle w:val="FirstParagraph"/>
       </w:pPr>
       <w:r>
-        <w:t xml:space="preserve">The built-in buttons cover the open slag, chloride salt, and Al-Zn alloy databases shipped with the present work, plus the two unified demonstrations (aluminum recycling and steelmaking). If the system you need is not among them, there are two doors:</w:t>
+        <w:t xml:space="preserve">The built-in buttons cover the open slag, chloride salt, and Al-Zn alloy databases shipped with the present work, the two unified demonstrations (aluminum recycling and steelmaking), and the two third-generation examples in the XTDB card (aluminum-carbon and lead-tin). If the system you need is not among them, there are two doors:</w:t>
       </w:r>
     </w:p>
     <w:p>

</xml_diff>